<commit_message>
All changes for 2026 - so far
</commit_message>
<xml_diff>
--- a/output/StandardsList-table.docx
+++ b/output/StandardsList-table.docx
@@ -116,7 +116,7 @@
               <w:jc w:val="center"/>
             </w:pPr>
             <w:r>
-              <w:t xml:space="preserve">Content Credentials</w:t>
+              <w:t xml:space="preserve">Content Credentials (C2PA)</w:t>
             </w:r>
           </w:p>
         </w:tc>
@@ -190,56 +190,68 @@
               <w:jc w:val="center"/>
             </w:pPr>
             <w:r>
-              <w:t xml:space="preserve">Content Credentials</w:t>
-            </w:r>
-          </w:p>
-        </w:tc>
-        <w:tc>
-          <w:tcPr/>
-          <w:p>
-            <w:pPr>
-              <w:pStyle w:val="Compact"/>
-              <w:jc w:val="center"/>
-            </w:pPr>
-            <w:r>
-              <w:t xml:space="preserve">X</w:t>
-            </w:r>
-          </w:p>
-        </w:tc>
-        <w:tc>
-          <w:tcPr/>
-          <w:p>
-            <w:pPr>
-              <w:pStyle w:val="Compact"/>
-              <w:jc w:val="center"/>
-            </w:pPr>
-            <w:r>
-              <w:t xml:space="preserve">X</w:t>
-            </w:r>
-          </w:p>
-        </w:tc>
-        <w:tc>
-          <w:tcPr/>
-          <w:p>
-            <w:pPr>
-              <w:pStyle w:val="Compact"/>
-            </w:pPr>
-          </w:p>
-        </w:tc>
-        <w:tc>
-          <w:tcPr/>
-          <w:p>
-            <w:pPr>
-              <w:pStyle w:val="Compact"/>
-            </w:pPr>
-          </w:p>
-        </w:tc>
-        <w:tc>
-          <w:tcPr/>
-          <w:p>
-            <w:pPr>
-              <w:pStyle w:val="Compact"/>
-            </w:pPr>
+              <w:t xml:space="preserve">JPEG Trust Part 1: Core foundation</w:t>
+            </w:r>
+          </w:p>
+        </w:tc>
+        <w:tc>
+          <w:tcPr/>
+          <w:p>
+            <w:pPr>
+              <w:pStyle w:val="Compact"/>
+              <w:jc w:val="center"/>
+            </w:pPr>
+            <w:r>
+              <w:t xml:space="preserve">X</w:t>
+            </w:r>
+          </w:p>
+        </w:tc>
+        <w:tc>
+          <w:tcPr/>
+          <w:p>
+            <w:pPr>
+              <w:pStyle w:val="Compact"/>
+              <w:jc w:val="center"/>
+            </w:pPr>
+            <w:r>
+              <w:t xml:space="preserve">X</w:t>
+            </w:r>
+          </w:p>
+        </w:tc>
+        <w:tc>
+          <w:tcPr/>
+          <w:p>
+            <w:pPr>
+              <w:pStyle w:val="Compact"/>
+              <w:jc w:val="center"/>
+            </w:pPr>
+            <w:r>
+              <w:t xml:space="preserve">X</w:t>
+            </w:r>
+          </w:p>
+        </w:tc>
+        <w:tc>
+          <w:tcPr/>
+          <w:p>
+            <w:pPr>
+              <w:pStyle w:val="Compact"/>
+              <w:jc w:val="center"/>
+            </w:pPr>
+            <w:r>
+              <w:t xml:space="preserve">X</w:t>
+            </w:r>
+          </w:p>
+        </w:tc>
+        <w:tc>
+          <w:tcPr/>
+          <w:p>
+            <w:pPr>
+              <w:pStyle w:val="Compact"/>
+              <w:jc w:val="center"/>
+            </w:pPr>
+            <w:r>
+              <w:t xml:space="preserve">X</w:t>
+            </w:r>
           </w:p>
         </w:tc>
         <w:tc>
@@ -260,68 +272,52 @@
               <w:jc w:val="center"/>
             </w:pPr>
             <w:r>
-              <w:t xml:space="preserve">JPEG Trust Part 1: Core foundation</w:t>
-            </w:r>
-          </w:p>
-        </w:tc>
-        <w:tc>
-          <w:tcPr/>
-          <w:p>
-            <w:pPr>
-              <w:pStyle w:val="Compact"/>
-              <w:jc w:val="center"/>
-            </w:pPr>
-            <w:r>
-              <w:t xml:space="preserve">X</w:t>
-            </w:r>
-          </w:p>
-        </w:tc>
-        <w:tc>
-          <w:tcPr/>
-          <w:p>
-            <w:pPr>
-              <w:pStyle w:val="Compact"/>
-              <w:jc w:val="center"/>
-            </w:pPr>
-            <w:r>
-              <w:t xml:space="preserve">X</w:t>
-            </w:r>
-          </w:p>
-        </w:tc>
-        <w:tc>
-          <w:tcPr/>
-          <w:p>
-            <w:pPr>
-              <w:pStyle w:val="Compact"/>
-              <w:jc w:val="center"/>
-            </w:pPr>
-            <w:r>
-              <w:t xml:space="preserve">X</w:t>
-            </w:r>
-          </w:p>
-        </w:tc>
-        <w:tc>
-          <w:tcPr/>
-          <w:p>
-            <w:pPr>
-              <w:pStyle w:val="Compact"/>
-              <w:jc w:val="center"/>
-            </w:pPr>
-            <w:r>
-              <w:t xml:space="preserve">X</w:t>
-            </w:r>
-          </w:p>
-        </w:tc>
-        <w:tc>
-          <w:tcPr/>
-          <w:p>
-            <w:pPr>
-              <w:pStyle w:val="Compact"/>
-              <w:jc w:val="center"/>
-            </w:pPr>
-            <w:r>
-              <w:t xml:space="preserve">X</w:t>
-            </w:r>
+              <w:t xml:space="preserve">JPEG Trust Part 2: Trust profiles catalog</w:t>
+            </w:r>
+          </w:p>
+        </w:tc>
+        <w:tc>
+          <w:tcPr/>
+          <w:p>
+            <w:pPr>
+              <w:pStyle w:val="Compact"/>
+            </w:pPr>
+          </w:p>
+        </w:tc>
+        <w:tc>
+          <w:tcPr/>
+          <w:p>
+            <w:pPr>
+              <w:pStyle w:val="Compact"/>
+              <w:jc w:val="center"/>
+            </w:pPr>
+            <w:r>
+              <w:t xml:space="preserve">X</w:t>
+            </w:r>
+          </w:p>
+        </w:tc>
+        <w:tc>
+          <w:tcPr/>
+          <w:p>
+            <w:pPr>
+              <w:pStyle w:val="Compact"/>
+            </w:pPr>
+          </w:p>
+        </w:tc>
+        <w:tc>
+          <w:tcPr/>
+          <w:p>
+            <w:pPr>
+              <w:pStyle w:val="Compact"/>
+            </w:pPr>
+          </w:p>
+        </w:tc>
+        <w:tc>
+          <w:tcPr/>
+          <w:p>
+            <w:pPr>
+              <w:pStyle w:val="Compact"/>
+            </w:pPr>
           </w:p>
         </w:tc>
         <w:tc>
@@ -342,52 +338,52 @@
               <w:jc w:val="center"/>
             </w:pPr>
             <w:r>
-              <w:t xml:space="preserve">JPEG Trust Part 2: Trust profiles catalog</w:t>
-            </w:r>
-          </w:p>
-        </w:tc>
-        <w:tc>
-          <w:tcPr/>
-          <w:p>
-            <w:pPr>
-              <w:pStyle w:val="Compact"/>
-            </w:pPr>
-          </w:p>
-        </w:tc>
-        <w:tc>
-          <w:tcPr/>
-          <w:p>
-            <w:pPr>
-              <w:pStyle w:val="Compact"/>
-              <w:jc w:val="center"/>
-            </w:pPr>
-            <w:r>
-              <w:t xml:space="preserve">X</w:t>
-            </w:r>
-          </w:p>
-        </w:tc>
-        <w:tc>
-          <w:tcPr/>
-          <w:p>
-            <w:pPr>
-              <w:pStyle w:val="Compact"/>
-            </w:pPr>
-          </w:p>
-        </w:tc>
-        <w:tc>
-          <w:tcPr/>
-          <w:p>
-            <w:pPr>
-              <w:pStyle w:val="Compact"/>
-            </w:pPr>
-          </w:p>
-        </w:tc>
-        <w:tc>
-          <w:tcPr/>
-          <w:p>
-            <w:pPr>
-              <w:pStyle w:val="Compact"/>
-            </w:pPr>
+              <w:t xml:space="preserve">JPEG Trust Part 3: Media asset watermarking</w:t>
+            </w:r>
+          </w:p>
+        </w:tc>
+        <w:tc>
+          <w:tcPr/>
+          <w:p>
+            <w:pPr>
+              <w:pStyle w:val="Compact"/>
+            </w:pPr>
+          </w:p>
+        </w:tc>
+        <w:tc>
+          <w:tcPr/>
+          <w:p>
+            <w:pPr>
+              <w:pStyle w:val="Compact"/>
+            </w:pPr>
+          </w:p>
+        </w:tc>
+        <w:tc>
+          <w:tcPr/>
+          <w:p>
+            <w:pPr>
+              <w:pStyle w:val="Compact"/>
+            </w:pPr>
+          </w:p>
+        </w:tc>
+        <w:tc>
+          <w:tcPr/>
+          <w:p>
+            <w:pPr>
+              <w:pStyle w:val="Compact"/>
+            </w:pPr>
+          </w:p>
+        </w:tc>
+        <w:tc>
+          <w:tcPr/>
+          <w:p>
+            <w:pPr>
+              <w:pStyle w:val="Compact"/>
+              <w:jc w:val="center"/>
+            </w:pPr>
+            <w:r>
+              <w:t xml:space="preserve">X</w:t>
+            </w:r>
           </w:p>
         </w:tc>
         <w:tc>
@@ -408,52 +404,60 @@
               <w:jc w:val="center"/>
             </w:pPr>
             <w:r>
-              <w:t xml:space="preserve">JPEG Trust Part 3: Media asset watermarking</w:t>
-            </w:r>
-          </w:p>
-        </w:tc>
-        <w:tc>
-          <w:tcPr/>
-          <w:p>
-            <w:pPr>
-              <w:pStyle w:val="Compact"/>
-            </w:pPr>
-          </w:p>
-        </w:tc>
-        <w:tc>
-          <w:tcPr/>
-          <w:p>
-            <w:pPr>
-              <w:pStyle w:val="Compact"/>
-            </w:pPr>
-          </w:p>
-        </w:tc>
-        <w:tc>
-          <w:tcPr/>
-          <w:p>
-            <w:pPr>
-              <w:pStyle w:val="Compact"/>
-            </w:pPr>
-          </w:p>
-        </w:tc>
-        <w:tc>
-          <w:tcPr/>
-          <w:p>
-            <w:pPr>
-              <w:pStyle w:val="Compact"/>
-            </w:pPr>
-          </w:p>
-        </w:tc>
-        <w:tc>
-          <w:tcPr/>
-          <w:p>
-            <w:pPr>
-              <w:pStyle w:val="Compact"/>
-              <w:jc w:val="center"/>
-            </w:pPr>
-            <w:r>
-              <w:t xml:space="preserve">X</w:t>
-            </w:r>
+              <w:t xml:space="preserve">CAWG Metadata</w:t>
+            </w:r>
+          </w:p>
+        </w:tc>
+        <w:tc>
+          <w:tcPr/>
+          <w:p>
+            <w:pPr>
+              <w:pStyle w:val="Compact"/>
+              <w:jc w:val="center"/>
+            </w:pPr>
+            <w:r>
+              <w:t xml:space="preserve">X</w:t>
+            </w:r>
+          </w:p>
+        </w:tc>
+        <w:tc>
+          <w:tcPr/>
+          <w:p>
+            <w:pPr>
+              <w:pStyle w:val="Compact"/>
+              <w:jc w:val="center"/>
+            </w:pPr>
+            <w:r>
+              <w:t xml:space="preserve">X</w:t>
+            </w:r>
+          </w:p>
+        </w:tc>
+        <w:tc>
+          <w:tcPr/>
+          <w:p>
+            <w:pPr>
+              <w:pStyle w:val="Compact"/>
+            </w:pPr>
+          </w:p>
+        </w:tc>
+        <w:tc>
+          <w:tcPr/>
+          <w:p>
+            <w:pPr>
+              <w:pStyle w:val="Compact"/>
+              <w:jc w:val="center"/>
+            </w:pPr>
+            <w:r>
+              <w:t xml:space="preserve">X</w:t>
+            </w:r>
+          </w:p>
+        </w:tc>
+        <w:tc>
+          <w:tcPr/>
+          <w:p>
+            <w:pPr>
+              <w:pStyle w:val="Compact"/>
+            </w:pPr>
           </w:p>
         </w:tc>
         <w:tc>
@@ -474,52 +478,48 @@
               <w:jc w:val="center"/>
             </w:pPr>
             <w:r>
-              <w:t xml:space="preserve">CAWG Metadata</w:t>
-            </w:r>
-          </w:p>
-        </w:tc>
-        <w:tc>
-          <w:tcPr/>
-          <w:p>
-            <w:pPr>
-              <w:pStyle w:val="Compact"/>
-              <w:jc w:val="center"/>
-            </w:pPr>
-            <w:r>
-              <w:t xml:space="preserve">X</w:t>
-            </w:r>
-          </w:p>
-        </w:tc>
-        <w:tc>
-          <w:tcPr/>
-          <w:p>
-            <w:pPr>
-              <w:pStyle w:val="Compact"/>
-              <w:jc w:val="center"/>
-            </w:pPr>
-            <w:r>
-              <w:t xml:space="preserve">X</w:t>
-            </w:r>
-          </w:p>
-        </w:tc>
-        <w:tc>
-          <w:tcPr/>
-          <w:p>
-            <w:pPr>
-              <w:pStyle w:val="Compact"/>
-            </w:pPr>
-          </w:p>
-        </w:tc>
-        <w:tc>
-          <w:tcPr/>
-          <w:p>
-            <w:pPr>
-              <w:pStyle w:val="Compact"/>
-              <w:jc w:val="center"/>
-            </w:pPr>
-            <w:r>
-              <w:t xml:space="preserve">X</w:t>
-            </w:r>
+              <w:t xml:space="preserve">Originator Profile</w:t>
+            </w:r>
+          </w:p>
+        </w:tc>
+        <w:tc>
+          <w:tcPr/>
+          <w:p>
+            <w:pPr>
+              <w:pStyle w:val="Compact"/>
+              <w:jc w:val="center"/>
+            </w:pPr>
+            <w:r>
+              <w:t xml:space="preserve">X</w:t>
+            </w:r>
+          </w:p>
+        </w:tc>
+        <w:tc>
+          <w:tcPr/>
+          <w:p>
+            <w:pPr>
+              <w:pStyle w:val="Compact"/>
+              <w:jc w:val="center"/>
+            </w:pPr>
+            <w:r>
+              <w:t xml:space="preserve">X</w:t>
+            </w:r>
+          </w:p>
+        </w:tc>
+        <w:tc>
+          <w:tcPr/>
+          <w:p>
+            <w:pPr>
+              <w:pStyle w:val="Compact"/>
+            </w:pPr>
+          </w:p>
+        </w:tc>
+        <w:tc>
+          <w:tcPr/>
+          <w:p>
+            <w:pPr>
+              <w:pStyle w:val="Compact"/>
+            </w:pPr>
           </w:p>
         </w:tc>
         <w:tc>
@@ -548,20 +548,16 @@
               <w:jc w:val="center"/>
             </w:pPr>
             <w:r>
-              <w:t xml:space="preserve">Originator Profile</w:t>
-            </w:r>
-          </w:p>
-        </w:tc>
-        <w:tc>
-          <w:tcPr/>
-          <w:p>
-            <w:pPr>
-              <w:pStyle w:val="Compact"/>
-              <w:jc w:val="center"/>
-            </w:pPr>
-            <w:r>
-              <w:t xml:space="preserve">X</w:t>
-            </w:r>
+              <w:t xml:space="preserve">Overview of trustworthiness in artificial intelligence</w:t>
+            </w:r>
+          </w:p>
+        </w:tc>
+        <w:tc>
+          <w:tcPr/>
+          <w:p>
+            <w:pPr>
+              <w:pStyle w:val="Compact"/>
+            </w:pPr>
           </w:p>
         </w:tc>
         <w:tc>
@@ -618,20 +614,16 @@
               <w:jc w:val="center"/>
             </w:pPr>
             <w:r>
-              <w:t xml:space="preserve">PROV</w:t>
-            </w:r>
-          </w:p>
-        </w:tc>
-        <w:tc>
-          <w:tcPr/>
-          <w:p>
-            <w:pPr>
-              <w:pStyle w:val="Compact"/>
-              <w:jc w:val="center"/>
-            </w:pPr>
-            <w:r>
-              <w:t xml:space="preserve">X</w:t>
-            </w:r>
+              <w:t xml:space="preserve">Framework for trust-based media services</w:t>
+            </w:r>
+          </w:p>
+        </w:tc>
+        <w:tc>
+          <w:tcPr/>
+          <w:p>
+            <w:pPr>
+              <w:pStyle w:val="Compact"/>
+            </w:pPr>
           </w:p>
         </w:tc>
         <w:tc>
@@ -688,44 +680,48 @@
               <w:jc w:val="center"/>
             </w:pPr>
             <w:r>
-              <w:t xml:space="preserve">Overview of trustworthiness in artificial intelligence</w:t>
-            </w:r>
-          </w:p>
-        </w:tc>
-        <w:tc>
-          <w:tcPr/>
-          <w:p>
-            <w:pPr>
-              <w:pStyle w:val="Compact"/>
-            </w:pPr>
-          </w:p>
-        </w:tc>
-        <w:tc>
-          <w:tcPr/>
-          <w:p>
-            <w:pPr>
-              <w:pStyle w:val="Compact"/>
-              <w:jc w:val="center"/>
-            </w:pPr>
-            <w:r>
-              <w:t xml:space="preserve">X</w:t>
-            </w:r>
-          </w:p>
-        </w:tc>
-        <w:tc>
-          <w:tcPr/>
-          <w:p>
-            <w:pPr>
-              <w:pStyle w:val="Compact"/>
-            </w:pPr>
-          </w:p>
-        </w:tc>
-        <w:tc>
-          <w:tcPr/>
-          <w:p>
-            <w:pPr>
-              <w:pStyle w:val="Compact"/>
-            </w:pPr>
+              <w:t xml:space="preserve">Trust.txt</w:t>
+            </w:r>
+          </w:p>
+        </w:tc>
+        <w:tc>
+          <w:tcPr/>
+          <w:p>
+            <w:pPr>
+              <w:pStyle w:val="Compact"/>
+            </w:pPr>
+          </w:p>
+        </w:tc>
+        <w:tc>
+          <w:tcPr/>
+          <w:p>
+            <w:pPr>
+              <w:pStyle w:val="Compact"/>
+              <w:jc w:val="center"/>
+            </w:pPr>
+            <w:r>
+              <w:t xml:space="preserve">X</w:t>
+            </w:r>
+          </w:p>
+        </w:tc>
+        <w:tc>
+          <w:tcPr/>
+          <w:p>
+            <w:pPr>
+              <w:pStyle w:val="Compact"/>
+            </w:pPr>
+          </w:p>
+        </w:tc>
+        <w:tc>
+          <w:tcPr/>
+          <w:p>
+            <w:pPr>
+              <w:pStyle w:val="Compact"/>
+              <w:jc w:val="center"/>
+            </w:pPr>
+            <w:r>
+              <w:t xml:space="preserve">X</w:t>
+            </w:r>
           </w:p>
         </w:tc>
         <w:tc>
@@ -754,7 +750,7 @@
               <w:jc w:val="center"/>
             </w:pPr>
             <w:r>
-              <w:t xml:space="preserve">Framework for trust-based media services</w:t>
+              <w:t xml:space="preserve">Chromium Reputation Provider Framework</w:t>
             </w:r>
           </w:p>
         </w:tc>
@@ -820,48 +816,44 @@
               <w:jc w:val="center"/>
             </w:pPr>
             <w:r>
-              <w:t xml:space="preserve">Trust.txt</w:t>
-            </w:r>
-          </w:p>
-        </w:tc>
-        <w:tc>
-          <w:tcPr/>
-          <w:p>
-            <w:pPr>
-              <w:pStyle w:val="Compact"/>
-            </w:pPr>
-          </w:p>
-        </w:tc>
-        <w:tc>
-          <w:tcPr/>
-          <w:p>
-            <w:pPr>
-              <w:pStyle w:val="Compact"/>
-              <w:jc w:val="center"/>
-            </w:pPr>
-            <w:r>
-              <w:t xml:space="preserve">X</w:t>
-            </w:r>
-          </w:p>
-        </w:tc>
-        <w:tc>
-          <w:tcPr/>
-          <w:p>
-            <w:pPr>
-              <w:pStyle w:val="Compact"/>
-            </w:pPr>
-          </w:p>
-        </w:tc>
-        <w:tc>
-          <w:tcPr/>
-          <w:p>
-            <w:pPr>
-              <w:pStyle w:val="Compact"/>
-              <w:jc w:val="center"/>
-            </w:pPr>
-            <w:r>
-              <w:t xml:space="preserve">X</w:t>
-            </w:r>
+              <w:t xml:space="preserve">ISCC: International Standard Content Code (ISCC)</w:t>
+            </w:r>
+          </w:p>
+        </w:tc>
+        <w:tc>
+          <w:tcPr/>
+          <w:p>
+            <w:pPr>
+              <w:pStyle w:val="Compact"/>
+            </w:pPr>
+          </w:p>
+        </w:tc>
+        <w:tc>
+          <w:tcPr/>
+          <w:p>
+            <w:pPr>
+              <w:pStyle w:val="Compact"/>
+            </w:pPr>
+          </w:p>
+        </w:tc>
+        <w:tc>
+          <w:tcPr/>
+          <w:p>
+            <w:pPr>
+              <w:pStyle w:val="Compact"/>
+              <w:jc w:val="center"/>
+            </w:pPr>
+            <w:r>
+              <w:t xml:space="preserve">X</w:t>
+            </w:r>
+          </w:p>
+        </w:tc>
+        <w:tc>
+          <w:tcPr/>
+          <w:p>
+            <w:pPr>
+              <w:pStyle w:val="Compact"/>
+            </w:pPr>
           </w:p>
         </w:tc>
         <w:tc>
@@ -890,36 +882,36 @@
               <w:jc w:val="center"/>
             </w:pPr>
             <w:r>
-              <w:t xml:space="preserve">Chromium Reputation Provider Framework</w:t>
-            </w:r>
-          </w:p>
-        </w:tc>
-        <w:tc>
-          <w:tcPr/>
-          <w:p>
-            <w:pPr>
-              <w:pStyle w:val="Compact"/>
-            </w:pPr>
-          </w:p>
-        </w:tc>
-        <w:tc>
-          <w:tcPr/>
-          <w:p>
-            <w:pPr>
-              <w:pStyle w:val="Compact"/>
-              <w:jc w:val="center"/>
-            </w:pPr>
-            <w:r>
-              <w:t xml:space="preserve">X</w:t>
-            </w:r>
-          </w:p>
-        </w:tc>
-        <w:tc>
-          <w:tcPr/>
-          <w:p>
-            <w:pPr>
-              <w:pStyle w:val="Compact"/>
-            </w:pPr>
+              <w:t xml:space="preserve">Global Media Identifier (GMI)</w:t>
+            </w:r>
+          </w:p>
+        </w:tc>
+        <w:tc>
+          <w:tcPr/>
+          <w:p>
+            <w:pPr>
+              <w:pStyle w:val="Compact"/>
+            </w:pPr>
+          </w:p>
+        </w:tc>
+        <w:tc>
+          <w:tcPr/>
+          <w:p>
+            <w:pPr>
+              <w:pStyle w:val="Compact"/>
+            </w:pPr>
+          </w:p>
+        </w:tc>
+        <w:tc>
+          <w:tcPr/>
+          <w:p>
+            <w:pPr>
+              <w:pStyle w:val="Compact"/>
+              <w:jc w:val="center"/>
+            </w:pPr>
+            <w:r>
+              <w:t xml:space="preserve">X</w:t>
+            </w:r>
           </w:p>
         </w:tc>
         <w:tc>
@@ -956,44 +948,44 @@
               <w:jc w:val="center"/>
             </w:pPr>
             <w:r>
-              <w:t xml:space="preserve">ISCC: International Standard Content Code (ISCC)</w:t>
-            </w:r>
-          </w:p>
-        </w:tc>
-        <w:tc>
-          <w:tcPr/>
-          <w:p>
-            <w:pPr>
-              <w:pStyle w:val="Compact"/>
-            </w:pPr>
-          </w:p>
-        </w:tc>
-        <w:tc>
-          <w:tcPr/>
-          <w:p>
-            <w:pPr>
-              <w:pStyle w:val="Compact"/>
-            </w:pPr>
-          </w:p>
-        </w:tc>
-        <w:tc>
-          <w:tcPr/>
-          <w:p>
-            <w:pPr>
-              <w:pStyle w:val="Compact"/>
-              <w:jc w:val="center"/>
-            </w:pPr>
-            <w:r>
-              <w:t xml:space="preserve">X</w:t>
-            </w:r>
-          </w:p>
-        </w:tc>
-        <w:tc>
-          <w:tcPr/>
-          <w:p>
-            <w:pPr>
-              <w:pStyle w:val="Compact"/>
-            </w:pPr>
+              <w:t xml:space="preserve">TDM Reservation Protocol</w:t>
+            </w:r>
+          </w:p>
+        </w:tc>
+        <w:tc>
+          <w:tcPr/>
+          <w:p>
+            <w:pPr>
+              <w:pStyle w:val="Compact"/>
+            </w:pPr>
+          </w:p>
+        </w:tc>
+        <w:tc>
+          <w:tcPr/>
+          <w:p>
+            <w:pPr>
+              <w:pStyle w:val="Compact"/>
+            </w:pPr>
+          </w:p>
+        </w:tc>
+        <w:tc>
+          <w:tcPr/>
+          <w:p>
+            <w:pPr>
+              <w:pStyle w:val="Compact"/>
+            </w:pPr>
+          </w:p>
+        </w:tc>
+        <w:tc>
+          <w:tcPr/>
+          <w:p>
+            <w:pPr>
+              <w:pStyle w:val="Compact"/>
+              <w:jc w:val="center"/>
+            </w:pPr>
+            <w:r>
+              <w:t xml:space="preserve">X</w:t>
+            </w:r>
           </w:p>
         </w:tc>
         <w:tc>
@@ -1022,44 +1014,44 @@
               <w:jc w:val="center"/>
             </w:pPr>
             <w:r>
-              <w:t xml:space="preserve">Unique Media Identifier (UMid)</w:t>
-            </w:r>
-          </w:p>
-        </w:tc>
-        <w:tc>
-          <w:tcPr/>
-          <w:p>
-            <w:pPr>
-              <w:pStyle w:val="Compact"/>
-            </w:pPr>
-          </w:p>
-        </w:tc>
-        <w:tc>
-          <w:tcPr/>
-          <w:p>
-            <w:pPr>
-              <w:pStyle w:val="Compact"/>
-            </w:pPr>
-          </w:p>
-        </w:tc>
-        <w:tc>
-          <w:tcPr/>
-          <w:p>
-            <w:pPr>
-              <w:pStyle w:val="Compact"/>
-              <w:jc w:val="center"/>
-            </w:pPr>
-            <w:r>
-              <w:t xml:space="preserve">X</w:t>
-            </w:r>
-          </w:p>
-        </w:tc>
-        <w:tc>
-          <w:tcPr/>
-          <w:p>
-            <w:pPr>
-              <w:pStyle w:val="Compact"/>
-            </w:pPr>
+              <w:t xml:space="preserve">Robots Exclusion Protocol</w:t>
+            </w:r>
+          </w:p>
+        </w:tc>
+        <w:tc>
+          <w:tcPr/>
+          <w:p>
+            <w:pPr>
+              <w:pStyle w:val="Compact"/>
+            </w:pPr>
+          </w:p>
+        </w:tc>
+        <w:tc>
+          <w:tcPr/>
+          <w:p>
+            <w:pPr>
+              <w:pStyle w:val="Compact"/>
+            </w:pPr>
+          </w:p>
+        </w:tc>
+        <w:tc>
+          <w:tcPr/>
+          <w:p>
+            <w:pPr>
+              <w:pStyle w:val="Compact"/>
+            </w:pPr>
+          </w:p>
+        </w:tc>
+        <w:tc>
+          <w:tcPr/>
+          <w:p>
+            <w:pPr>
+              <w:pStyle w:val="Compact"/>
+              <w:jc w:val="center"/>
+            </w:pPr>
+            <w:r>
+              <w:t xml:space="preserve">X</w:t>
+            </w:r>
           </w:p>
         </w:tc>
         <w:tc>
@@ -1088,7 +1080,7 @@
               <w:jc w:val="center"/>
             </w:pPr>
             <w:r>
-              <w:t xml:space="preserve">TDM Reservation Protocol</w:t>
+              <w:t xml:space="preserve">Vocabulary for expressing AI usage preferences</w:t>
             </w:r>
           </w:p>
         </w:tc>
@@ -1154,52 +1146,56 @@
               <w:jc w:val="center"/>
             </w:pPr>
             <w:r>
-              <w:t xml:space="preserve">ai.txt</w:t>
-            </w:r>
-          </w:p>
-        </w:tc>
-        <w:tc>
-          <w:tcPr/>
-          <w:p>
-            <w:pPr>
-              <w:pStyle w:val="Compact"/>
-            </w:pPr>
-          </w:p>
-        </w:tc>
-        <w:tc>
-          <w:tcPr/>
-          <w:p>
-            <w:pPr>
-              <w:pStyle w:val="Compact"/>
-            </w:pPr>
-          </w:p>
-        </w:tc>
-        <w:tc>
-          <w:tcPr/>
-          <w:p>
-            <w:pPr>
-              <w:pStyle w:val="Compact"/>
-            </w:pPr>
-          </w:p>
-        </w:tc>
-        <w:tc>
-          <w:tcPr/>
-          <w:p>
-            <w:pPr>
-              <w:pStyle w:val="Compact"/>
-              <w:jc w:val="center"/>
-            </w:pPr>
-            <w:r>
-              <w:t xml:space="preserve">X</w:t>
-            </w:r>
-          </w:p>
-        </w:tc>
-        <w:tc>
-          <w:tcPr/>
-          <w:p>
-            <w:pPr>
-              <w:pStyle w:val="Compact"/>
-            </w:pPr>
+              <w:t xml:space="preserve">Open Binding of Content Identifiers (OBID)</w:t>
+            </w:r>
+          </w:p>
+        </w:tc>
+        <w:tc>
+          <w:tcPr/>
+          <w:p>
+            <w:pPr>
+              <w:pStyle w:val="Compact"/>
+            </w:pPr>
+          </w:p>
+        </w:tc>
+        <w:tc>
+          <w:tcPr/>
+          <w:p>
+            <w:pPr>
+              <w:pStyle w:val="Compact"/>
+            </w:pPr>
+          </w:p>
+        </w:tc>
+        <w:tc>
+          <w:tcPr/>
+          <w:p>
+            <w:pPr>
+              <w:pStyle w:val="Compact"/>
+              <w:jc w:val="center"/>
+            </w:pPr>
+            <w:r>
+              <w:t xml:space="preserve">X</w:t>
+            </w:r>
+          </w:p>
+        </w:tc>
+        <w:tc>
+          <w:tcPr/>
+          <w:p>
+            <w:pPr>
+              <w:pStyle w:val="Compact"/>
+            </w:pPr>
+          </w:p>
+        </w:tc>
+        <w:tc>
+          <w:tcPr/>
+          <w:p>
+            <w:pPr>
+              <w:pStyle w:val="Compact"/>
+              <w:jc w:val="center"/>
+            </w:pPr>
+            <w:r>
+              <w:t xml:space="preserve">X</w:t>
+            </w:r>
           </w:p>
         </w:tc>
         <w:tc>
@@ -1220,52 +1216,52 @@
               <w:jc w:val="center"/>
             </w:pPr>
             <w:r>
-              <w:t xml:space="preserve">Robots Exclusion Protocol</w:t>
-            </w:r>
-          </w:p>
-        </w:tc>
-        <w:tc>
-          <w:tcPr/>
-          <w:p>
-            <w:pPr>
-              <w:pStyle w:val="Compact"/>
-            </w:pPr>
-          </w:p>
-        </w:tc>
-        <w:tc>
-          <w:tcPr/>
-          <w:p>
-            <w:pPr>
-              <w:pStyle w:val="Compact"/>
-            </w:pPr>
-          </w:p>
-        </w:tc>
-        <w:tc>
-          <w:tcPr/>
-          <w:p>
-            <w:pPr>
-              <w:pStyle w:val="Compact"/>
-            </w:pPr>
-          </w:p>
-        </w:tc>
-        <w:tc>
-          <w:tcPr/>
-          <w:p>
-            <w:pPr>
-              <w:pStyle w:val="Compact"/>
-              <w:jc w:val="center"/>
-            </w:pPr>
-            <w:r>
-              <w:t xml:space="preserve">X</w:t>
-            </w:r>
-          </w:p>
-        </w:tc>
-        <w:tc>
-          <w:tcPr/>
-          <w:p>
-            <w:pPr>
-              <w:pStyle w:val="Compact"/>
-            </w:pPr>
+              <w:t xml:space="preserve">X.ig-dw: Implementation guidelines for digital watermarking</w:t>
+            </w:r>
+          </w:p>
+        </w:tc>
+        <w:tc>
+          <w:tcPr/>
+          <w:p>
+            <w:pPr>
+              <w:pStyle w:val="Compact"/>
+            </w:pPr>
+          </w:p>
+        </w:tc>
+        <w:tc>
+          <w:tcPr/>
+          <w:p>
+            <w:pPr>
+              <w:pStyle w:val="Compact"/>
+            </w:pPr>
+          </w:p>
+        </w:tc>
+        <w:tc>
+          <w:tcPr/>
+          <w:p>
+            <w:pPr>
+              <w:pStyle w:val="Compact"/>
+            </w:pPr>
+          </w:p>
+        </w:tc>
+        <w:tc>
+          <w:tcPr/>
+          <w:p>
+            <w:pPr>
+              <w:pStyle w:val="Compact"/>
+            </w:pPr>
+          </w:p>
+        </w:tc>
+        <w:tc>
+          <w:tcPr/>
+          <w:p>
+            <w:pPr>
+              <w:pStyle w:val="Compact"/>
+              <w:jc w:val="center"/>
+            </w:pPr>
+            <w:r>
+              <w:t xml:space="preserve">X</w:t>
+            </w:r>
           </w:p>
         </w:tc>
         <w:tc>
@@ -1286,44 +1282,40 @@
               <w:jc w:val="center"/>
             </w:pPr>
             <w:r>
-              <w:t xml:space="preserve">Vocabulary for Expressing Content Preferences for AI Training</w:t>
-            </w:r>
-          </w:p>
-        </w:tc>
-        <w:tc>
-          <w:tcPr/>
-          <w:p>
-            <w:pPr>
-              <w:pStyle w:val="Compact"/>
-            </w:pPr>
-          </w:p>
-        </w:tc>
-        <w:tc>
-          <w:tcPr/>
-          <w:p>
-            <w:pPr>
-              <w:pStyle w:val="Compact"/>
-            </w:pPr>
-          </w:p>
-        </w:tc>
-        <w:tc>
-          <w:tcPr/>
-          <w:p>
-            <w:pPr>
-              <w:pStyle w:val="Compact"/>
-            </w:pPr>
-          </w:p>
-        </w:tc>
-        <w:tc>
-          <w:tcPr/>
-          <w:p>
-            <w:pPr>
-              <w:pStyle w:val="Compact"/>
-              <w:jc w:val="center"/>
-            </w:pPr>
-            <w:r>
-              <w:t xml:space="preserve">X</w:t>
-            </w:r>
+              <w:t xml:space="preserve">DRM technology for digital publications</w:t>
+            </w:r>
+          </w:p>
+        </w:tc>
+        <w:tc>
+          <w:tcPr/>
+          <w:p>
+            <w:pPr>
+              <w:pStyle w:val="Compact"/>
+            </w:pPr>
+          </w:p>
+        </w:tc>
+        <w:tc>
+          <w:tcPr/>
+          <w:p>
+            <w:pPr>
+              <w:pStyle w:val="Compact"/>
+            </w:pPr>
+          </w:p>
+        </w:tc>
+        <w:tc>
+          <w:tcPr/>
+          <w:p>
+            <w:pPr>
+              <w:pStyle w:val="Compact"/>
+            </w:pPr>
+          </w:p>
+        </w:tc>
+        <w:tc>
+          <w:tcPr/>
+          <w:p>
+            <w:pPr>
+              <w:pStyle w:val="Compact"/>
+            </w:pPr>
           </w:p>
         </w:tc>
         <w:tc>
@@ -1352,56 +1344,52 @@
               <w:jc w:val="center"/>
             </w:pPr>
             <w:r>
-              <w:t xml:space="preserve">Open Binding of Content Identifiers (OBID)</w:t>
-            </w:r>
-          </w:p>
-        </w:tc>
-        <w:tc>
-          <w:tcPr/>
-          <w:p>
-            <w:pPr>
-              <w:pStyle w:val="Compact"/>
-            </w:pPr>
-          </w:p>
-        </w:tc>
-        <w:tc>
-          <w:tcPr/>
-          <w:p>
-            <w:pPr>
-              <w:pStyle w:val="Compact"/>
-            </w:pPr>
-          </w:p>
-        </w:tc>
-        <w:tc>
-          <w:tcPr/>
-          <w:p>
-            <w:pPr>
-              <w:pStyle w:val="Compact"/>
-              <w:jc w:val="center"/>
-            </w:pPr>
-            <w:r>
-              <w:t xml:space="preserve">X</w:t>
-            </w:r>
-          </w:p>
-        </w:tc>
-        <w:tc>
-          <w:tcPr/>
-          <w:p>
-            <w:pPr>
-              <w:pStyle w:val="Compact"/>
-            </w:pPr>
-          </w:p>
-        </w:tc>
-        <w:tc>
-          <w:tcPr/>
-          <w:p>
-            <w:pPr>
-              <w:pStyle w:val="Compact"/>
-              <w:jc w:val="center"/>
-            </w:pPr>
-            <w:r>
-              <w:t xml:space="preserve">X</w:t>
-            </w:r>
+              <w:t xml:space="preserve">Part 1: Overview of copyright protection technologies in use in the publishing industry</w:t>
+            </w:r>
+          </w:p>
+        </w:tc>
+        <w:tc>
+          <w:tcPr/>
+          <w:p>
+            <w:pPr>
+              <w:pStyle w:val="Compact"/>
+            </w:pPr>
+          </w:p>
+        </w:tc>
+        <w:tc>
+          <w:tcPr/>
+          <w:p>
+            <w:pPr>
+              <w:pStyle w:val="Compact"/>
+            </w:pPr>
+          </w:p>
+        </w:tc>
+        <w:tc>
+          <w:tcPr/>
+          <w:p>
+            <w:pPr>
+              <w:pStyle w:val="Compact"/>
+            </w:pPr>
+          </w:p>
+        </w:tc>
+        <w:tc>
+          <w:tcPr/>
+          <w:p>
+            <w:pPr>
+              <w:pStyle w:val="Compact"/>
+              <w:jc w:val="center"/>
+            </w:pPr>
+            <w:r>
+              <w:t xml:space="preserve">X</w:t>
+            </w:r>
+          </w:p>
+        </w:tc>
+        <w:tc>
+          <w:tcPr/>
+          <w:p>
+            <w:pPr>
+              <w:pStyle w:val="Compact"/>
+            </w:pPr>
           </w:p>
         </w:tc>
         <w:tc>
@@ -1422,52 +1410,48 @@
               <w:jc w:val="center"/>
             </w:pPr>
             <w:r>
-              <w:t xml:space="preserve">X.ig-dw: Implementation guidelines for digital watermarking</w:t>
-            </w:r>
-          </w:p>
-        </w:tc>
-        <w:tc>
-          <w:tcPr/>
-          <w:p>
-            <w:pPr>
-              <w:pStyle w:val="Compact"/>
-            </w:pPr>
-          </w:p>
-        </w:tc>
-        <w:tc>
-          <w:tcPr/>
-          <w:p>
-            <w:pPr>
-              <w:pStyle w:val="Compact"/>
-            </w:pPr>
-          </w:p>
-        </w:tc>
-        <w:tc>
-          <w:tcPr/>
-          <w:p>
-            <w:pPr>
-              <w:pStyle w:val="Compact"/>
-            </w:pPr>
-          </w:p>
-        </w:tc>
-        <w:tc>
-          <w:tcPr/>
-          <w:p>
-            <w:pPr>
-              <w:pStyle w:val="Compact"/>
-            </w:pPr>
-          </w:p>
-        </w:tc>
-        <w:tc>
-          <w:tcPr/>
-          <w:p>
-            <w:pPr>
-              <w:pStyle w:val="Compact"/>
-              <w:jc w:val="center"/>
-            </w:pPr>
-            <w:r>
-              <w:t xml:space="preserve">X</w:t>
-            </w:r>
+              <w:t xml:space="preserve">IEEE Draft Standard for Evaluation Method of</w:t>
+            </w:r>
+          </w:p>
+        </w:tc>
+        <w:tc>
+          <w:tcPr/>
+          <w:p>
+            <w:pPr>
+              <w:pStyle w:val="Compact"/>
+            </w:pPr>
+          </w:p>
+        </w:tc>
+        <w:tc>
+          <w:tcPr/>
+          <w:p>
+            <w:pPr>
+              <w:pStyle w:val="Compact"/>
+            </w:pPr>
+          </w:p>
+        </w:tc>
+        <w:tc>
+          <w:tcPr/>
+          <w:p>
+            <w:pPr>
+              <w:pStyle w:val="Compact"/>
+            </w:pPr>
+          </w:p>
+        </w:tc>
+        <w:tc>
+          <w:tcPr/>
+          <w:p>
+            <w:pPr>
+              <w:pStyle w:val="Compact"/>
+            </w:pPr>
+          </w:p>
+        </w:tc>
+        <w:tc>
+          <w:tcPr/>
+          <w:p>
+            <w:pPr>
+              <w:pStyle w:val="Compact"/>
+            </w:pPr>
           </w:p>
         </w:tc>
         <w:tc>
@@ -1488,48 +1472,52 @@
               <w:jc w:val="center"/>
             </w:pPr>
             <w:r>
-              <w:t xml:space="preserve">DRM technology for digital publications</w:t>
-            </w:r>
-          </w:p>
-        </w:tc>
-        <w:tc>
-          <w:tcPr/>
-          <w:p>
-            <w:pPr>
-              <w:pStyle w:val="Compact"/>
-            </w:pPr>
-          </w:p>
-        </w:tc>
-        <w:tc>
-          <w:tcPr/>
-          <w:p>
-            <w:pPr>
-              <w:pStyle w:val="Compact"/>
-            </w:pPr>
-          </w:p>
-        </w:tc>
-        <w:tc>
-          <w:tcPr/>
-          <w:p>
-            <w:pPr>
-              <w:pStyle w:val="Compact"/>
-            </w:pPr>
-          </w:p>
-        </w:tc>
-        <w:tc>
-          <w:tcPr/>
-          <w:p>
-            <w:pPr>
-              <w:pStyle w:val="Compact"/>
-            </w:pPr>
-          </w:p>
-        </w:tc>
-        <w:tc>
-          <w:tcPr/>
-          <w:p>
-            <w:pPr>
-              <w:pStyle w:val="Compact"/>
-            </w:pPr>
+              <w:t xml:space="preserve">Robustness of Digital Watermarking Implementation in Digital Contents</w:t>
+            </w:r>
+          </w:p>
+        </w:tc>
+        <w:tc>
+          <w:tcPr/>
+          <w:p>
+            <w:pPr>
+              <w:pStyle w:val="Compact"/>
+            </w:pPr>
+          </w:p>
+        </w:tc>
+        <w:tc>
+          <w:tcPr/>
+          <w:p>
+            <w:pPr>
+              <w:pStyle w:val="Compact"/>
+            </w:pPr>
+          </w:p>
+        </w:tc>
+        <w:tc>
+          <w:tcPr/>
+          <w:p>
+            <w:pPr>
+              <w:pStyle w:val="Compact"/>
+            </w:pPr>
+          </w:p>
+        </w:tc>
+        <w:tc>
+          <w:tcPr/>
+          <w:p>
+            <w:pPr>
+              <w:pStyle w:val="Compact"/>
+            </w:pPr>
+          </w:p>
+        </w:tc>
+        <w:tc>
+          <w:tcPr/>
+          <w:p>
+            <w:pPr>
+              <w:pStyle w:val="Compact"/>
+              <w:jc w:val="center"/>
+            </w:pPr>
+            <w:r>
+              <w:t xml:space="preserve">X</w:t>
+            </w:r>
           </w:p>
         </w:tc>
         <w:tc>
@@ -1550,44 +1538,40 @@
               <w:jc w:val="center"/>
             </w:pPr>
             <w:r>
-              <w:t xml:space="preserve">Part 1: Overview of copyright protection technologies in use in the publishing industry</w:t>
-            </w:r>
-          </w:p>
-        </w:tc>
-        <w:tc>
-          <w:tcPr/>
-          <w:p>
-            <w:pPr>
-              <w:pStyle w:val="Compact"/>
-            </w:pPr>
-          </w:p>
-        </w:tc>
-        <w:tc>
-          <w:tcPr/>
-          <w:p>
-            <w:pPr>
-              <w:pStyle w:val="Compact"/>
-            </w:pPr>
-          </w:p>
-        </w:tc>
-        <w:tc>
-          <w:tcPr/>
-          <w:p>
-            <w:pPr>
-              <w:pStyle w:val="Compact"/>
-            </w:pPr>
-          </w:p>
-        </w:tc>
-        <w:tc>
-          <w:tcPr/>
-          <w:p>
-            <w:pPr>
-              <w:pStyle w:val="Compact"/>
-              <w:jc w:val="center"/>
-            </w:pPr>
-            <w:r>
-              <w:t xml:space="preserve">X</w:t>
-            </w:r>
+              <w:t xml:space="preserve">H.MMAUTH:</w:t>
+            </w:r>
+          </w:p>
+        </w:tc>
+        <w:tc>
+          <w:tcPr/>
+          <w:p>
+            <w:pPr>
+              <w:pStyle w:val="Compact"/>
+            </w:pPr>
+          </w:p>
+        </w:tc>
+        <w:tc>
+          <w:tcPr/>
+          <w:p>
+            <w:pPr>
+              <w:pStyle w:val="Compact"/>
+            </w:pPr>
+          </w:p>
+        </w:tc>
+        <w:tc>
+          <w:tcPr/>
+          <w:p>
+            <w:pPr>
+              <w:pStyle w:val="Compact"/>
+            </w:pPr>
+          </w:p>
+        </w:tc>
+        <w:tc>
+          <w:tcPr/>
+          <w:p>
+            <w:pPr>
+              <w:pStyle w:val="Compact"/>
+            </w:pPr>
           </w:p>
         </w:tc>
         <w:tc>
@@ -1616,52 +1600,52 @@
               <w:jc w:val="center"/>
             </w:pPr>
             <w:r>
-              <w:t xml:space="preserve">A Review of Medical Image Watermarking Requirements for Teleradiology</w:t>
-            </w:r>
-          </w:p>
-        </w:tc>
-        <w:tc>
-          <w:tcPr/>
-          <w:p>
-            <w:pPr>
-              <w:pStyle w:val="Compact"/>
-            </w:pPr>
-          </w:p>
-        </w:tc>
-        <w:tc>
-          <w:tcPr/>
-          <w:p>
-            <w:pPr>
-              <w:pStyle w:val="Compact"/>
-            </w:pPr>
-          </w:p>
-        </w:tc>
-        <w:tc>
-          <w:tcPr/>
-          <w:p>
-            <w:pPr>
-              <w:pStyle w:val="Compact"/>
-            </w:pPr>
-          </w:p>
-        </w:tc>
-        <w:tc>
-          <w:tcPr/>
-          <w:p>
-            <w:pPr>
-              <w:pStyle w:val="Compact"/>
-            </w:pPr>
-          </w:p>
-        </w:tc>
-        <w:tc>
-          <w:tcPr/>
-          <w:p>
-            <w:pPr>
-              <w:pStyle w:val="Compact"/>
-              <w:jc w:val="center"/>
-            </w:pPr>
-            <w:r>
-              <w:t xml:space="preserve">X</w:t>
-            </w:r>
+              <w:t xml:space="preserve">Framework for authentication of multimedia content</w:t>
+            </w:r>
+          </w:p>
+        </w:tc>
+        <w:tc>
+          <w:tcPr/>
+          <w:p>
+            <w:pPr>
+              <w:pStyle w:val="Compact"/>
+            </w:pPr>
+          </w:p>
+        </w:tc>
+        <w:tc>
+          <w:tcPr/>
+          <w:p>
+            <w:pPr>
+              <w:pStyle w:val="Compact"/>
+              <w:jc w:val="center"/>
+            </w:pPr>
+            <w:r>
+              <w:t xml:space="preserve">X</w:t>
+            </w:r>
+          </w:p>
+        </w:tc>
+        <w:tc>
+          <w:tcPr/>
+          <w:p>
+            <w:pPr>
+              <w:pStyle w:val="Compact"/>
+            </w:pPr>
+          </w:p>
+        </w:tc>
+        <w:tc>
+          <w:tcPr/>
+          <w:p>
+            <w:pPr>
+              <w:pStyle w:val="Compact"/>
+            </w:pPr>
+          </w:p>
+        </w:tc>
+        <w:tc>
+          <w:tcPr/>
+          <w:p>
+            <w:pPr>
+              <w:pStyle w:val="Compact"/>
+            </w:pPr>
           </w:p>
         </w:tc>
         <w:tc>
@@ -1682,56 +1666,48 @@
               <w:jc w:val="center"/>
             </w:pPr>
             <w:r>
-              <w:t xml:space="preserve">MPEG-21 — Part 11: Evaluation Tools for Persistent Association Technologies</w:t>
-            </w:r>
-          </w:p>
-        </w:tc>
-        <w:tc>
-          <w:tcPr/>
-          <w:p>
-            <w:pPr>
-              <w:pStyle w:val="Compact"/>
-            </w:pPr>
-          </w:p>
-        </w:tc>
-        <w:tc>
-          <w:tcPr/>
-          <w:p>
-            <w:pPr>
-              <w:pStyle w:val="Compact"/>
-              <w:jc w:val="center"/>
-            </w:pPr>
-            <w:r>
-              <w:t xml:space="preserve">X</w:t>
-            </w:r>
-          </w:p>
-        </w:tc>
-        <w:tc>
-          <w:tcPr/>
-          <w:p>
-            <w:pPr>
-              <w:pStyle w:val="Compact"/>
-            </w:pPr>
-          </w:p>
-        </w:tc>
-        <w:tc>
-          <w:tcPr/>
-          <w:p>
-            <w:pPr>
-              <w:pStyle w:val="Compact"/>
-            </w:pPr>
-          </w:p>
-        </w:tc>
-        <w:tc>
-          <w:tcPr/>
-          <w:p>
-            <w:pPr>
-              <w:pStyle w:val="Compact"/>
-              <w:jc w:val="center"/>
-            </w:pPr>
-            <w:r>
-              <w:t xml:space="preserve">X</w:t>
-            </w:r>
+              <w:t xml:space="preserve">H.274(V4):</w:t>
+            </w:r>
+          </w:p>
+        </w:tc>
+        <w:tc>
+          <w:tcPr/>
+          <w:p>
+            <w:pPr>
+              <w:pStyle w:val="Compact"/>
+            </w:pPr>
+          </w:p>
+        </w:tc>
+        <w:tc>
+          <w:tcPr/>
+          <w:p>
+            <w:pPr>
+              <w:pStyle w:val="Compact"/>
+            </w:pPr>
+          </w:p>
+        </w:tc>
+        <w:tc>
+          <w:tcPr/>
+          <w:p>
+            <w:pPr>
+              <w:pStyle w:val="Compact"/>
+            </w:pPr>
+          </w:p>
+        </w:tc>
+        <w:tc>
+          <w:tcPr/>
+          <w:p>
+            <w:pPr>
+              <w:pStyle w:val="Compact"/>
+            </w:pPr>
+          </w:p>
+        </w:tc>
+        <w:tc>
+          <w:tcPr/>
+          <w:p>
+            <w:pPr>
+              <w:pStyle w:val="Compact"/>
+            </w:pPr>
           </w:p>
         </w:tc>
         <w:tc>
@@ -1752,24 +1728,28 @@
               <w:jc w:val="center"/>
             </w:pPr>
             <w:r>
-              <w:t xml:space="preserve">IEEE Draft Standard for Evaluation Method of</w:t>
-            </w:r>
-          </w:p>
-        </w:tc>
-        <w:tc>
-          <w:tcPr/>
-          <w:p>
-            <w:pPr>
-              <w:pStyle w:val="Compact"/>
-            </w:pPr>
-          </w:p>
-        </w:tc>
-        <w:tc>
-          <w:tcPr/>
-          <w:p>
-            <w:pPr>
-              <w:pStyle w:val="Compact"/>
-            </w:pPr>
+              <w:t xml:space="preserve">Versatile supplemental enhancement information messages for coded video bitstreams</w:t>
+            </w:r>
+          </w:p>
+        </w:tc>
+        <w:tc>
+          <w:tcPr/>
+          <w:p>
+            <w:pPr>
+              <w:pStyle w:val="Compact"/>
+            </w:pPr>
+          </w:p>
+        </w:tc>
+        <w:tc>
+          <w:tcPr/>
+          <w:p>
+            <w:pPr>
+              <w:pStyle w:val="Compact"/>
+              <w:jc w:val="center"/>
+            </w:pPr>
+            <w:r>
+              <w:t xml:space="preserve">X</w:t>
+            </w:r>
           </w:p>
         </w:tc>
         <w:tc>
@@ -1814,52 +1794,48 @@
               <w:jc w:val="center"/>
             </w:pPr>
             <w:r>
-              <w:t xml:space="preserve">Robustness of Digital Watermarking Implementation in Digital Contents</w:t>
-            </w:r>
-          </w:p>
-        </w:tc>
-        <w:tc>
-          <w:tcPr/>
-          <w:p>
-            <w:pPr>
-              <w:pStyle w:val="Compact"/>
-            </w:pPr>
-          </w:p>
-        </w:tc>
-        <w:tc>
-          <w:tcPr/>
-          <w:p>
-            <w:pPr>
-              <w:pStyle w:val="Compact"/>
-            </w:pPr>
-          </w:p>
-        </w:tc>
-        <w:tc>
-          <w:tcPr/>
-          <w:p>
-            <w:pPr>
-              <w:pStyle w:val="Compact"/>
-            </w:pPr>
-          </w:p>
-        </w:tc>
-        <w:tc>
-          <w:tcPr/>
-          <w:p>
-            <w:pPr>
-              <w:pStyle w:val="Compact"/>
-            </w:pPr>
-          </w:p>
-        </w:tc>
-        <w:tc>
-          <w:tcPr/>
-          <w:p>
-            <w:pPr>
-              <w:pStyle w:val="Compact"/>
-              <w:jc w:val="center"/>
-            </w:pPr>
-            <w:r>
-              <w:t xml:space="preserve">X</w:t>
-            </w:r>
+              <w:t xml:space="preserve">H.VADS:</w:t>
+            </w:r>
+          </w:p>
+        </w:tc>
+        <w:tc>
+          <w:tcPr/>
+          <w:p>
+            <w:pPr>
+              <w:pStyle w:val="Compact"/>
+            </w:pPr>
+          </w:p>
+        </w:tc>
+        <w:tc>
+          <w:tcPr/>
+          <w:p>
+            <w:pPr>
+              <w:pStyle w:val="Compact"/>
+            </w:pPr>
+          </w:p>
+        </w:tc>
+        <w:tc>
+          <w:tcPr/>
+          <w:p>
+            <w:pPr>
+              <w:pStyle w:val="Compact"/>
+            </w:pPr>
+          </w:p>
+        </w:tc>
+        <w:tc>
+          <w:tcPr/>
+          <w:p>
+            <w:pPr>
+              <w:pStyle w:val="Compact"/>
+            </w:pPr>
+          </w:p>
+        </w:tc>
+        <w:tc>
+          <w:tcPr/>
+          <w:p>
+            <w:pPr>
+              <w:pStyle w:val="Compact"/>
+            </w:pPr>
           </w:p>
         </w:tc>
         <w:tc>
@@ -1880,24 +1856,28 @@
               <w:jc w:val="center"/>
             </w:pPr>
             <w:r>
-              <w:t xml:space="preserve">H.MMAUTH:</w:t>
-            </w:r>
-          </w:p>
-        </w:tc>
-        <w:tc>
-          <w:tcPr/>
-          <w:p>
-            <w:pPr>
-              <w:pStyle w:val="Compact"/>
-            </w:pPr>
-          </w:p>
-        </w:tc>
-        <w:tc>
-          <w:tcPr/>
-          <w:p>
-            <w:pPr>
-              <w:pStyle w:val="Compact"/>
-            </w:pPr>
+              <w:t xml:space="preserve">Assessment criteria for video authenticity detection services</w:t>
+            </w:r>
+          </w:p>
+        </w:tc>
+        <w:tc>
+          <w:tcPr/>
+          <w:p>
+            <w:pPr>
+              <w:pStyle w:val="Compact"/>
+            </w:pPr>
+          </w:p>
+        </w:tc>
+        <w:tc>
+          <w:tcPr/>
+          <w:p>
+            <w:pPr>
+              <w:pStyle w:val="Compact"/>
+              <w:jc w:val="center"/>
+            </w:pPr>
+            <w:r>
+              <w:t xml:space="preserve">X</w:t>
+            </w:r>
           </w:p>
         </w:tc>
         <w:tc>
@@ -1942,60 +1922,60 @@
               <w:jc w:val="center"/>
             </w:pPr>
             <w:r>
-              <w:t xml:space="preserve">Framework for authentication of multimedia content</w:t>
-            </w:r>
-          </w:p>
-        </w:tc>
-        <w:tc>
-          <w:tcPr/>
-          <w:p>
-            <w:pPr>
-              <w:pStyle w:val="Compact"/>
-            </w:pPr>
-          </w:p>
-        </w:tc>
-        <w:tc>
-          <w:tcPr/>
-          <w:p>
-            <w:pPr>
-              <w:pStyle w:val="Compact"/>
-              <w:jc w:val="center"/>
-            </w:pPr>
-            <w:r>
-              <w:t xml:space="preserve">X</w:t>
-            </w:r>
-          </w:p>
-        </w:tc>
-        <w:tc>
-          <w:tcPr/>
-          <w:p>
-            <w:pPr>
-              <w:pStyle w:val="Compact"/>
-            </w:pPr>
-          </w:p>
-        </w:tc>
-        <w:tc>
-          <w:tcPr/>
-          <w:p>
-            <w:pPr>
-              <w:pStyle w:val="Compact"/>
-            </w:pPr>
-          </w:p>
-        </w:tc>
-        <w:tc>
-          <w:tcPr/>
-          <w:p>
-            <w:pPr>
-              <w:pStyle w:val="Compact"/>
-            </w:pPr>
-          </w:p>
-        </w:tc>
-        <w:tc>
-          <w:tcPr/>
-          <w:p>
-            <w:pPr>
-              <w:pStyle w:val="Compact"/>
-            </w:pPr>
+              <w:t xml:space="preserve">Credible Web</w:t>
+            </w:r>
+          </w:p>
+        </w:tc>
+        <w:tc>
+          <w:tcPr/>
+          <w:p>
+            <w:pPr>
+              <w:pStyle w:val="Compact"/>
+            </w:pPr>
+          </w:p>
+        </w:tc>
+        <w:tc>
+          <w:tcPr/>
+          <w:p>
+            <w:pPr>
+              <w:pStyle w:val="Compact"/>
+            </w:pPr>
+          </w:p>
+        </w:tc>
+        <w:tc>
+          <w:tcPr/>
+          <w:p>
+            <w:pPr>
+              <w:pStyle w:val="Compact"/>
+            </w:pPr>
+          </w:p>
+        </w:tc>
+        <w:tc>
+          <w:tcPr/>
+          <w:p>
+            <w:pPr>
+              <w:pStyle w:val="Compact"/>
+            </w:pPr>
+          </w:p>
+        </w:tc>
+        <w:tc>
+          <w:tcPr/>
+          <w:p>
+            <w:pPr>
+              <w:pStyle w:val="Compact"/>
+            </w:pPr>
+          </w:p>
+        </w:tc>
+        <w:tc>
+          <w:tcPr/>
+          <w:p>
+            <w:pPr>
+              <w:pStyle w:val="Compact"/>
+              <w:jc w:val="center"/>
+            </w:pPr>
+            <w:r>
+              <w:t xml:space="preserve">X</w:t>
+            </w:r>
           </w:p>
         </w:tc>
       </w:tr>
@@ -2008,56 +1988,60 @@
               <w:jc w:val="center"/>
             </w:pPr>
             <w:r>
-              <w:t xml:space="preserve">H.274(V4):</w:t>
-            </w:r>
-          </w:p>
-        </w:tc>
-        <w:tc>
-          <w:tcPr/>
-          <w:p>
-            <w:pPr>
-              <w:pStyle w:val="Compact"/>
-            </w:pPr>
-          </w:p>
-        </w:tc>
-        <w:tc>
-          <w:tcPr/>
-          <w:p>
-            <w:pPr>
-              <w:pStyle w:val="Compact"/>
-            </w:pPr>
-          </w:p>
-        </w:tc>
-        <w:tc>
-          <w:tcPr/>
-          <w:p>
-            <w:pPr>
-              <w:pStyle w:val="Compact"/>
-            </w:pPr>
-          </w:p>
-        </w:tc>
-        <w:tc>
-          <w:tcPr/>
-          <w:p>
-            <w:pPr>
-              <w:pStyle w:val="Compact"/>
-            </w:pPr>
-          </w:p>
-        </w:tc>
-        <w:tc>
-          <w:tcPr/>
-          <w:p>
-            <w:pPr>
-              <w:pStyle w:val="Compact"/>
-            </w:pPr>
-          </w:p>
-        </w:tc>
-        <w:tc>
-          <w:tcPr/>
-          <w:p>
-            <w:pPr>
-              <w:pStyle w:val="Compact"/>
-            </w:pPr>
+              <w:t xml:space="preserve">Technical and Governance Guidelines for Responsible Data Collection</w:t>
+            </w:r>
+          </w:p>
+        </w:tc>
+        <w:tc>
+          <w:tcPr/>
+          <w:p>
+            <w:pPr>
+              <w:pStyle w:val="Compact"/>
+            </w:pPr>
+          </w:p>
+        </w:tc>
+        <w:tc>
+          <w:tcPr/>
+          <w:p>
+            <w:pPr>
+              <w:pStyle w:val="Compact"/>
+            </w:pPr>
+          </w:p>
+        </w:tc>
+        <w:tc>
+          <w:tcPr/>
+          <w:p>
+            <w:pPr>
+              <w:pStyle w:val="Compact"/>
+            </w:pPr>
+          </w:p>
+        </w:tc>
+        <w:tc>
+          <w:tcPr/>
+          <w:p>
+            <w:pPr>
+              <w:pStyle w:val="Compact"/>
+            </w:pPr>
+          </w:p>
+        </w:tc>
+        <w:tc>
+          <w:tcPr/>
+          <w:p>
+            <w:pPr>
+              <w:pStyle w:val="Compact"/>
+            </w:pPr>
+          </w:p>
+        </w:tc>
+        <w:tc>
+          <w:tcPr/>
+          <w:p>
+            <w:pPr>
+              <w:pStyle w:val="Compact"/>
+              <w:jc w:val="center"/>
+            </w:pPr>
+            <w:r>
+              <w:t xml:space="preserve">X</w:t>
+            </w:r>
           </w:p>
         </w:tc>
       </w:tr>
@@ -2070,60 +2054,60 @@
               <w:jc w:val="center"/>
             </w:pPr>
             <w:r>
-              <w:t xml:space="preserve">Versatile supplemental enhancement information messages for coded video bitstreams</w:t>
-            </w:r>
-          </w:p>
-        </w:tc>
-        <w:tc>
-          <w:tcPr/>
-          <w:p>
-            <w:pPr>
-              <w:pStyle w:val="Compact"/>
-            </w:pPr>
-          </w:p>
-        </w:tc>
-        <w:tc>
-          <w:tcPr/>
-          <w:p>
-            <w:pPr>
-              <w:pStyle w:val="Compact"/>
-              <w:jc w:val="center"/>
-            </w:pPr>
-            <w:r>
-              <w:t xml:space="preserve">X</w:t>
-            </w:r>
-          </w:p>
-        </w:tc>
-        <w:tc>
-          <w:tcPr/>
-          <w:p>
-            <w:pPr>
-              <w:pStyle w:val="Compact"/>
-            </w:pPr>
-          </w:p>
-        </w:tc>
-        <w:tc>
-          <w:tcPr/>
-          <w:p>
-            <w:pPr>
-              <w:pStyle w:val="Compact"/>
-            </w:pPr>
-          </w:p>
-        </w:tc>
-        <w:tc>
-          <w:tcPr/>
-          <w:p>
-            <w:pPr>
-              <w:pStyle w:val="Compact"/>
-            </w:pPr>
-          </w:p>
-        </w:tc>
-        <w:tc>
-          <w:tcPr/>
-          <w:p>
-            <w:pPr>
-              <w:pStyle w:val="Compact"/>
-            </w:pPr>
+              <w:t xml:space="preserve">Data Provenance Standards</w:t>
+            </w:r>
+          </w:p>
+        </w:tc>
+        <w:tc>
+          <w:tcPr/>
+          <w:p>
+            <w:pPr>
+              <w:pStyle w:val="Compact"/>
+            </w:pPr>
+          </w:p>
+        </w:tc>
+        <w:tc>
+          <w:tcPr/>
+          <w:p>
+            <w:pPr>
+              <w:pStyle w:val="Compact"/>
+            </w:pPr>
+          </w:p>
+        </w:tc>
+        <w:tc>
+          <w:tcPr/>
+          <w:p>
+            <w:pPr>
+              <w:pStyle w:val="Compact"/>
+            </w:pPr>
+          </w:p>
+        </w:tc>
+        <w:tc>
+          <w:tcPr/>
+          <w:p>
+            <w:pPr>
+              <w:pStyle w:val="Compact"/>
+            </w:pPr>
+          </w:p>
+        </w:tc>
+        <w:tc>
+          <w:tcPr/>
+          <w:p>
+            <w:pPr>
+              <w:pStyle w:val="Compact"/>
+            </w:pPr>
+          </w:p>
+        </w:tc>
+        <w:tc>
+          <w:tcPr/>
+          <w:p>
+            <w:pPr>
+              <w:pStyle w:val="Compact"/>
+              <w:jc w:val="center"/>
+            </w:pPr>
+            <w:r>
+              <w:t xml:space="preserve">X</w:t>
+            </w:r>
           </w:p>
         </w:tc>
       </w:tr>
@@ -2136,48 +2120,52 @@
               <w:jc w:val="center"/>
             </w:pPr>
             <w:r>
-              <w:t xml:space="preserve">H.VADS:</w:t>
-            </w:r>
-          </w:p>
-        </w:tc>
-        <w:tc>
-          <w:tcPr/>
-          <w:p>
-            <w:pPr>
-              <w:pStyle w:val="Compact"/>
-            </w:pPr>
-          </w:p>
-        </w:tc>
-        <w:tc>
-          <w:tcPr/>
-          <w:p>
-            <w:pPr>
-              <w:pStyle w:val="Compact"/>
-            </w:pPr>
-          </w:p>
-        </w:tc>
-        <w:tc>
-          <w:tcPr/>
-          <w:p>
-            <w:pPr>
-              <w:pStyle w:val="Compact"/>
-            </w:pPr>
-          </w:p>
-        </w:tc>
-        <w:tc>
-          <w:tcPr/>
-          <w:p>
-            <w:pPr>
-              <w:pStyle w:val="Compact"/>
-            </w:pPr>
-          </w:p>
-        </w:tc>
-        <w:tc>
-          <w:tcPr/>
-          <w:p>
-            <w:pPr>
-              <w:pStyle w:val="Compact"/>
-            </w:pPr>
+              <w:t xml:space="preserve">IEEE Standard for Transparent Human and Machine Agency Identification</w:t>
+            </w:r>
+          </w:p>
+        </w:tc>
+        <w:tc>
+          <w:tcPr/>
+          <w:p>
+            <w:pPr>
+              <w:pStyle w:val="Compact"/>
+            </w:pPr>
+          </w:p>
+        </w:tc>
+        <w:tc>
+          <w:tcPr/>
+          <w:p>
+            <w:pPr>
+              <w:pStyle w:val="Compact"/>
+            </w:pPr>
+          </w:p>
+        </w:tc>
+        <w:tc>
+          <w:tcPr/>
+          <w:p>
+            <w:pPr>
+              <w:pStyle w:val="Compact"/>
+            </w:pPr>
+          </w:p>
+        </w:tc>
+        <w:tc>
+          <w:tcPr/>
+          <w:p>
+            <w:pPr>
+              <w:pStyle w:val="Compact"/>
+            </w:pPr>
+          </w:p>
+        </w:tc>
+        <w:tc>
+          <w:tcPr/>
+          <w:p>
+            <w:pPr>
+              <w:pStyle w:val="Compact"/>
+              <w:jc w:val="center"/>
+            </w:pPr>
+            <w:r>
+              <w:t xml:space="preserve">X</w:t>
+            </w:r>
           </w:p>
         </w:tc>
         <w:tc>
@@ -2198,44 +2186,52 @@
               <w:jc w:val="center"/>
             </w:pPr>
             <w:r>
-              <w:t xml:space="preserve">Assessment criteria for video authenticity detection services</w:t>
-            </w:r>
-          </w:p>
-        </w:tc>
-        <w:tc>
-          <w:tcPr/>
-          <w:p>
-            <w:pPr>
-              <w:pStyle w:val="Compact"/>
-            </w:pPr>
-          </w:p>
-        </w:tc>
-        <w:tc>
-          <w:tcPr/>
-          <w:p>
-            <w:pPr>
-              <w:pStyle w:val="Compact"/>
-              <w:jc w:val="center"/>
-            </w:pPr>
-            <w:r>
-              <w:t xml:space="preserve">X</w:t>
-            </w:r>
-          </w:p>
-        </w:tc>
-        <w:tc>
-          <w:tcPr/>
-          <w:p>
-            <w:pPr>
-              <w:pStyle w:val="Compact"/>
-            </w:pPr>
-          </w:p>
-        </w:tc>
-        <w:tc>
-          <w:tcPr/>
-          <w:p>
-            <w:pPr>
-              <w:pStyle w:val="Compact"/>
-            </w:pPr>
+              <w:t xml:space="preserve">IPTC Photo Metadata Standard</w:t>
+            </w:r>
+          </w:p>
+        </w:tc>
+        <w:tc>
+          <w:tcPr/>
+          <w:p>
+            <w:pPr>
+              <w:pStyle w:val="Compact"/>
+              <w:jc w:val="center"/>
+            </w:pPr>
+            <w:r>
+              <w:t xml:space="preserve">X</w:t>
+            </w:r>
+          </w:p>
+        </w:tc>
+        <w:tc>
+          <w:tcPr/>
+          <w:p>
+            <w:pPr>
+              <w:pStyle w:val="Compact"/>
+              <w:jc w:val="center"/>
+            </w:pPr>
+            <w:r>
+              <w:t xml:space="preserve">X</w:t>
+            </w:r>
+          </w:p>
+        </w:tc>
+        <w:tc>
+          <w:tcPr/>
+          <w:p>
+            <w:pPr>
+              <w:pStyle w:val="Compact"/>
+            </w:pPr>
+          </w:p>
+        </w:tc>
+        <w:tc>
+          <w:tcPr/>
+          <w:p>
+            <w:pPr>
+              <w:pStyle w:val="Compact"/>
+              <w:jc w:val="center"/>
+            </w:pPr>
+            <w:r>
+              <w:t xml:space="preserve">X</w:t>
+            </w:r>
           </w:p>
         </w:tc>
         <w:tc>
@@ -2264,60 +2260,60 @@
               <w:jc w:val="center"/>
             </w:pPr>
             <w:r>
-              <w:t xml:space="preserve">Credible Web</w:t>
-            </w:r>
-          </w:p>
-        </w:tc>
-        <w:tc>
-          <w:tcPr/>
-          <w:p>
-            <w:pPr>
-              <w:pStyle w:val="Compact"/>
-            </w:pPr>
-          </w:p>
-        </w:tc>
-        <w:tc>
-          <w:tcPr/>
-          <w:p>
-            <w:pPr>
-              <w:pStyle w:val="Compact"/>
-            </w:pPr>
-          </w:p>
-        </w:tc>
-        <w:tc>
-          <w:tcPr/>
-          <w:p>
-            <w:pPr>
-              <w:pStyle w:val="Compact"/>
-            </w:pPr>
-          </w:p>
-        </w:tc>
-        <w:tc>
-          <w:tcPr/>
-          <w:p>
-            <w:pPr>
-              <w:pStyle w:val="Compact"/>
-            </w:pPr>
-          </w:p>
-        </w:tc>
-        <w:tc>
-          <w:tcPr/>
-          <w:p>
-            <w:pPr>
-              <w:pStyle w:val="Compact"/>
-            </w:pPr>
-          </w:p>
-        </w:tc>
-        <w:tc>
-          <w:tcPr/>
-          <w:p>
-            <w:pPr>
-              <w:pStyle w:val="Compact"/>
-              <w:jc w:val="center"/>
-            </w:pPr>
-            <w:r>
-              <w:t xml:space="preserve">X</w:t>
-            </w:r>
+              <w:t xml:space="preserve">DASH - Part 4: Segment Encryption and Authentication</w:t>
+            </w:r>
+          </w:p>
+        </w:tc>
+        <w:tc>
+          <w:tcPr/>
+          <w:p>
+            <w:pPr>
+              <w:pStyle w:val="Compact"/>
+            </w:pPr>
+          </w:p>
+        </w:tc>
+        <w:tc>
+          <w:tcPr/>
+          <w:p>
+            <w:pPr>
+              <w:pStyle w:val="Compact"/>
+              <w:jc w:val="center"/>
+            </w:pPr>
+            <w:r>
+              <w:t xml:space="preserve">X</w:t>
+            </w:r>
+          </w:p>
+        </w:tc>
+        <w:tc>
+          <w:tcPr/>
+          <w:p>
+            <w:pPr>
+              <w:pStyle w:val="Compact"/>
+            </w:pPr>
+          </w:p>
+        </w:tc>
+        <w:tc>
+          <w:tcPr/>
+          <w:p>
+            <w:pPr>
+              <w:pStyle w:val="Compact"/>
+            </w:pPr>
+          </w:p>
+        </w:tc>
+        <w:tc>
+          <w:tcPr/>
+          <w:p>
+            <w:pPr>
+              <w:pStyle w:val="Compact"/>
+            </w:pPr>
+          </w:p>
+        </w:tc>
+        <w:tc>
+          <w:tcPr/>
+          <w:p>
+            <w:pPr>
+              <w:pStyle w:val="Compact"/>
+            </w:pPr>
           </w:p>
         </w:tc>
       </w:tr>
@@ -2330,60 +2326,60 @@
               <w:jc w:val="center"/>
             </w:pPr>
             <w:r>
-              <w:t xml:space="preserve">Technical and Governance Guidelines for Responsible Data Collection</w:t>
-            </w:r>
-          </w:p>
-        </w:tc>
-        <w:tc>
-          <w:tcPr/>
-          <w:p>
-            <w:pPr>
-              <w:pStyle w:val="Compact"/>
-            </w:pPr>
-          </w:p>
-        </w:tc>
-        <w:tc>
-          <w:tcPr/>
-          <w:p>
-            <w:pPr>
-              <w:pStyle w:val="Compact"/>
-            </w:pPr>
-          </w:p>
-        </w:tc>
-        <w:tc>
-          <w:tcPr/>
-          <w:p>
-            <w:pPr>
-              <w:pStyle w:val="Compact"/>
-            </w:pPr>
-          </w:p>
-        </w:tc>
-        <w:tc>
-          <w:tcPr/>
-          <w:p>
-            <w:pPr>
-              <w:pStyle w:val="Compact"/>
-            </w:pPr>
-          </w:p>
-        </w:tc>
-        <w:tc>
-          <w:tcPr/>
-          <w:p>
-            <w:pPr>
-              <w:pStyle w:val="Compact"/>
-            </w:pPr>
-          </w:p>
-        </w:tc>
-        <w:tc>
-          <w:tcPr/>
-          <w:p>
-            <w:pPr>
-              <w:pStyle w:val="Compact"/>
-              <w:jc w:val="center"/>
-            </w:pPr>
-            <w:r>
-              <w:t xml:space="preserve">X</w:t>
-            </w:r>
+              <w:t xml:space="preserve">Recommended Practices for Levels of Artificial Intelligence Generated Content Technologies</w:t>
+            </w:r>
+          </w:p>
+        </w:tc>
+        <w:tc>
+          <w:tcPr/>
+          <w:p>
+            <w:pPr>
+              <w:pStyle w:val="Compact"/>
+            </w:pPr>
+          </w:p>
+        </w:tc>
+        <w:tc>
+          <w:tcPr/>
+          <w:p>
+            <w:pPr>
+              <w:pStyle w:val="Compact"/>
+              <w:jc w:val="center"/>
+            </w:pPr>
+            <w:r>
+              <w:t xml:space="preserve">X</w:t>
+            </w:r>
+          </w:p>
+        </w:tc>
+        <w:tc>
+          <w:tcPr/>
+          <w:p>
+            <w:pPr>
+              <w:pStyle w:val="Compact"/>
+            </w:pPr>
+          </w:p>
+        </w:tc>
+        <w:tc>
+          <w:tcPr/>
+          <w:p>
+            <w:pPr>
+              <w:pStyle w:val="Compact"/>
+            </w:pPr>
+          </w:p>
+        </w:tc>
+        <w:tc>
+          <w:tcPr/>
+          <w:p>
+            <w:pPr>
+              <w:pStyle w:val="Compact"/>
+            </w:pPr>
+          </w:p>
+        </w:tc>
+        <w:tc>
+          <w:tcPr/>
+          <w:p>
+            <w:pPr>
+              <w:pStyle w:val="Compact"/>
+            </w:pPr>
           </w:p>
         </w:tc>
       </w:tr>
@@ -2396,60 +2392,64 @@
               <w:jc w:val="center"/>
             </w:pPr>
             <w:r>
-              <w:t xml:space="preserve">Data Provenance Standards</w:t>
-            </w:r>
-          </w:p>
-        </w:tc>
-        <w:tc>
-          <w:tcPr/>
-          <w:p>
-            <w:pPr>
-              <w:pStyle w:val="Compact"/>
-            </w:pPr>
-          </w:p>
-        </w:tc>
-        <w:tc>
-          <w:tcPr/>
-          <w:p>
-            <w:pPr>
-              <w:pStyle w:val="Compact"/>
-            </w:pPr>
-          </w:p>
-        </w:tc>
-        <w:tc>
-          <w:tcPr/>
-          <w:p>
-            <w:pPr>
-              <w:pStyle w:val="Compact"/>
-            </w:pPr>
-          </w:p>
-        </w:tc>
-        <w:tc>
-          <w:tcPr/>
-          <w:p>
-            <w:pPr>
-              <w:pStyle w:val="Compact"/>
-            </w:pPr>
-          </w:p>
-        </w:tc>
-        <w:tc>
-          <w:tcPr/>
-          <w:p>
-            <w:pPr>
-              <w:pStyle w:val="Compact"/>
-            </w:pPr>
-          </w:p>
-        </w:tc>
-        <w:tc>
-          <w:tcPr/>
-          <w:p>
-            <w:pPr>
-              <w:pStyle w:val="Compact"/>
-              <w:jc w:val="center"/>
-            </w:pPr>
-            <w:r>
-              <w:t xml:space="preserve">X</w:t>
-            </w:r>
+              <w:t xml:space="preserve">CAWG Identity Assertion Specification</w:t>
+            </w:r>
+          </w:p>
+        </w:tc>
+        <w:tc>
+          <w:tcPr/>
+          <w:p>
+            <w:pPr>
+              <w:pStyle w:val="Compact"/>
+              <w:jc w:val="center"/>
+            </w:pPr>
+            <w:r>
+              <w:t xml:space="preserve">X</w:t>
+            </w:r>
+          </w:p>
+        </w:tc>
+        <w:tc>
+          <w:tcPr/>
+          <w:p>
+            <w:pPr>
+              <w:pStyle w:val="Compact"/>
+              <w:jc w:val="center"/>
+            </w:pPr>
+            <w:r>
+              <w:t xml:space="preserve">X</w:t>
+            </w:r>
+          </w:p>
+        </w:tc>
+        <w:tc>
+          <w:tcPr/>
+          <w:p>
+            <w:pPr>
+              <w:pStyle w:val="Compact"/>
+            </w:pPr>
+          </w:p>
+        </w:tc>
+        <w:tc>
+          <w:tcPr/>
+          <w:p>
+            <w:pPr>
+              <w:pStyle w:val="Compact"/>
+            </w:pPr>
+          </w:p>
+        </w:tc>
+        <w:tc>
+          <w:tcPr/>
+          <w:p>
+            <w:pPr>
+              <w:pStyle w:val="Compact"/>
+            </w:pPr>
+          </w:p>
+        </w:tc>
+        <w:tc>
+          <w:tcPr/>
+          <w:p>
+            <w:pPr>
+              <w:pStyle w:val="Compact"/>
+            </w:pPr>
           </w:p>
         </w:tc>
       </w:tr>
@@ -2462,52 +2462,52 @@
               <w:jc w:val="center"/>
             </w:pPr>
             <w:r>
-              <w:t xml:space="preserve">IEEE Standard for Transparent Human and Machine Agency Identification</w:t>
-            </w:r>
-          </w:p>
-        </w:tc>
-        <w:tc>
-          <w:tcPr/>
-          <w:p>
-            <w:pPr>
-              <w:pStyle w:val="Compact"/>
-            </w:pPr>
-          </w:p>
-        </w:tc>
-        <w:tc>
-          <w:tcPr/>
-          <w:p>
-            <w:pPr>
-              <w:pStyle w:val="Compact"/>
-            </w:pPr>
-          </w:p>
-        </w:tc>
-        <w:tc>
-          <w:tcPr/>
-          <w:p>
-            <w:pPr>
-              <w:pStyle w:val="Compact"/>
-            </w:pPr>
-          </w:p>
-        </w:tc>
-        <w:tc>
-          <w:tcPr/>
-          <w:p>
-            <w:pPr>
-              <w:pStyle w:val="Compact"/>
-            </w:pPr>
-          </w:p>
-        </w:tc>
-        <w:tc>
-          <w:tcPr/>
-          <w:p>
-            <w:pPr>
-              <w:pStyle w:val="Compact"/>
-              <w:jc w:val="center"/>
-            </w:pPr>
-            <w:r>
-              <w:t xml:space="preserve">X</w:t>
-            </w:r>
+              <w:t xml:space="preserve">W3C Verifiable Credentials Data Model v2.0</w:t>
+            </w:r>
+          </w:p>
+        </w:tc>
+        <w:tc>
+          <w:tcPr/>
+          <w:p>
+            <w:pPr>
+              <w:pStyle w:val="Compact"/>
+            </w:pPr>
+          </w:p>
+        </w:tc>
+        <w:tc>
+          <w:tcPr/>
+          <w:p>
+            <w:pPr>
+              <w:pStyle w:val="Compact"/>
+              <w:jc w:val="center"/>
+            </w:pPr>
+            <w:r>
+              <w:t xml:space="preserve">X</w:t>
+            </w:r>
+          </w:p>
+        </w:tc>
+        <w:tc>
+          <w:tcPr/>
+          <w:p>
+            <w:pPr>
+              <w:pStyle w:val="Compact"/>
+            </w:pPr>
+          </w:p>
+        </w:tc>
+        <w:tc>
+          <w:tcPr/>
+          <w:p>
+            <w:pPr>
+              <w:pStyle w:val="Compact"/>
+            </w:pPr>
+          </w:p>
+        </w:tc>
+        <w:tc>
+          <w:tcPr/>
+          <w:p>
+            <w:pPr>
+              <w:pStyle w:val="Compact"/>
+            </w:pPr>
           </w:p>
         </w:tc>
         <w:tc>
@@ -2528,60 +2528,56 @@
               <w:jc w:val="center"/>
             </w:pPr>
             <w:r>
-              <w:t xml:space="preserve">IPTC Photo Metadata Standard</w:t>
-            </w:r>
-          </w:p>
-        </w:tc>
-        <w:tc>
-          <w:tcPr/>
-          <w:p>
-            <w:pPr>
-              <w:pStyle w:val="Compact"/>
-              <w:jc w:val="center"/>
-            </w:pPr>
-            <w:r>
-              <w:t xml:space="preserve">X</w:t>
-            </w:r>
-          </w:p>
-        </w:tc>
-        <w:tc>
-          <w:tcPr/>
-          <w:p>
-            <w:pPr>
-              <w:pStyle w:val="Compact"/>
-              <w:jc w:val="center"/>
-            </w:pPr>
-            <w:r>
-              <w:t xml:space="preserve">X</w:t>
-            </w:r>
-          </w:p>
-        </w:tc>
-        <w:tc>
-          <w:tcPr/>
-          <w:p>
-            <w:pPr>
-              <w:pStyle w:val="Compact"/>
-            </w:pPr>
-          </w:p>
-        </w:tc>
-        <w:tc>
-          <w:tcPr/>
-          <w:p>
-            <w:pPr>
-              <w:pStyle w:val="Compact"/>
-              <w:jc w:val="center"/>
-            </w:pPr>
-            <w:r>
-              <w:t xml:space="preserve">X</w:t>
-            </w:r>
-          </w:p>
-        </w:tc>
-        <w:tc>
-          <w:tcPr/>
-          <w:p>
-            <w:pPr>
-              <w:pStyle w:val="Compact"/>
-            </w:pPr>
+              <w:t xml:space="preserve">NIST AI 100-4: Reducing Risks Posed by Synthetic Content</w:t>
+            </w:r>
+          </w:p>
+        </w:tc>
+        <w:tc>
+          <w:tcPr/>
+          <w:p>
+            <w:pPr>
+              <w:pStyle w:val="Compact"/>
+            </w:pPr>
+          </w:p>
+        </w:tc>
+        <w:tc>
+          <w:tcPr/>
+          <w:p>
+            <w:pPr>
+              <w:pStyle w:val="Compact"/>
+              <w:jc w:val="center"/>
+            </w:pPr>
+            <w:r>
+              <w:t xml:space="preserve">X</w:t>
+            </w:r>
+          </w:p>
+        </w:tc>
+        <w:tc>
+          <w:tcPr/>
+          <w:p>
+            <w:pPr>
+              <w:pStyle w:val="Compact"/>
+            </w:pPr>
+          </w:p>
+        </w:tc>
+        <w:tc>
+          <w:tcPr/>
+          <w:p>
+            <w:pPr>
+              <w:pStyle w:val="Compact"/>
+            </w:pPr>
+          </w:p>
+        </w:tc>
+        <w:tc>
+          <w:tcPr/>
+          <w:p>
+            <w:pPr>
+              <w:pStyle w:val="Compact"/>
+              <w:jc w:val="center"/>
+            </w:pPr>
+            <w:r>
+              <w:t xml:space="preserve">X</w:t>
+            </w:r>
           </w:p>
         </w:tc>
         <w:tc>
@@ -2602,36 +2598,36 @@
               <w:jc w:val="center"/>
             </w:pPr>
             <w:r>
-              <w:t xml:space="preserve">DASH - Part 4: Segment Encryption and Authentication</w:t>
-            </w:r>
-          </w:p>
-        </w:tc>
-        <w:tc>
-          <w:tcPr/>
-          <w:p>
-            <w:pPr>
-              <w:pStyle w:val="Compact"/>
-            </w:pPr>
-          </w:p>
-        </w:tc>
-        <w:tc>
-          <w:tcPr/>
-          <w:p>
-            <w:pPr>
-              <w:pStyle w:val="Compact"/>
-              <w:jc w:val="center"/>
-            </w:pPr>
-            <w:r>
-              <w:t xml:space="preserve">X</w:t>
-            </w:r>
-          </w:p>
-        </w:tc>
-        <w:tc>
-          <w:tcPr/>
-          <w:p>
-            <w:pPr>
-              <w:pStyle w:val="Compact"/>
-            </w:pPr>
+              <w:t xml:space="preserve">MPEG-21 Part 3: Digital Item Identification</w:t>
+            </w:r>
+          </w:p>
+        </w:tc>
+        <w:tc>
+          <w:tcPr/>
+          <w:p>
+            <w:pPr>
+              <w:pStyle w:val="Compact"/>
+            </w:pPr>
+          </w:p>
+        </w:tc>
+        <w:tc>
+          <w:tcPr/>
+          <w:p>
+            <w:pPr>
+              <w:pStyle w:val="Compact"/>
+            </w:pPr>
+          </w:p>
+        </w:tc>
+        <w:tc>
+          <w:tcPr/>
+          <w:p>
+            <w:pPr>
+              <w:pStyle w:val="Compact"/>
+              <w:jc w:val="center"/>
+            </w:pPr>
+            <w:r>
+              <w:t xml:space="preserve">X</w:t>
+            </w:r>
           </w:p>
         </w:tc>
         <w:tc>
@@ -2668,7 +2664,209 @@
               <w:jc w:val="center"/>
             </w:pPr>
             <w:r>
-              <w:t xml:space="preserve">Recommended Practices for Levels of Artificial Intelligence Generated Content Technologies</w:t>
+              <w:t xml:space="preserve">Cybersecurity technology—Labeling method for content generated by artificial intelligence</w:t>
+            </w:r>
+          </w:p>
+        </w:tc>
+        <w:tc>
+          <w:tcPr/>
+          <w:p>
+            <w:pPr>
+              <w:pStyle w:val="Compact"/>
+              <w:jc w:val="center"/>
+            </w:pPr>
+            <w:r>
+              <w:t xml:space="preserve">X</w:t>
+            </w:r>
+          </w:p>
+        </w:tc>
+        <w:tc>
+          <w:tcPr/>
+          <w:p>
+            <w:pPr>
+              <w:pStyle w:val="Compact"/>
+              <w:jc w:val="center"/>
+            </w:pPr>
+            <w:r>
+              <w:t xml:space="preserve">X</w:t>
+            </w:r>
+          </w:p>
+        </w:tc>
+        <w:tc>
+          <w:tcPr/>
+          <w:p>
+            <w:pPr>
+              <w:pStyle w:val="Compact"/>
+            </w:pPr>
+          </w:p>
+        </w:tc>
+        <w:tc>
+          <w:tcPr/>
+          <w:p>
+            <w:pPr>
+              <w:pStyle w:val="Compact"/>
+            </w:pPr>
+          </w:p>
+        </w:tc>
+        <w:tc>
+          <w:tcPr/>
+          <w:p>
+            <w:pPr>
+              <w:pStyle w:val="Compact"/>
+              <w:jc w:val="center"/>
+            </w:pPr>
+            <w:r>
+              <w:t xml:space="preserve">X</w:t>
+            </w:r>
+          </w:p>
+        </w:tc>
+        <w:tc>
+          <w:tcPr/>
+          <w:p>
+            <w:pPr>
+              <w:pStyle w:val="Compact"/>
+            </w:pPr>
+          </w:p>
+        </w:tc>
+      </w:tr>
+      <w:tr>
+        <w:tc>
+          <w:tcPr/>
+          <w:p>
+            <w:pPr>
+              <w:pStyle w:val="Compact"/>
+              <w:jc w:val="center"/>
+            </w:pPr>
+            <w:r>
+              <w:t xml:space="preserve">ITU-T X.2210</w:t>
+            </w:r>
+          </w:p>
+        </w:tc>
+        <w:tc>
+          <w:tcPr/>
+          <w:p>
+            <w:pPr>
+              <w:pStyle w:val="Compact"/>
+            </w:pPr>
+          </w:p>
+        </w:tc>
+        <w:tc>
+          <w:tcPr/>
+          <w:p>
+            <w:pPr>
+              <w:pStyle w:val="Compact"/>
+            </w:pPr>
+          </w:p>
+        </w:tc>
+        <w:tc>
+          <w:tcPr/>
+          <w:p>
+            <w:pPr>
+              <w:pStyle w:val="Compact"/>
+            </w:pPr>
+          </w:p>
+        </w:tc>
+        <w:tc>
+          <w:tcPr/>
+          <w:p>
+            <w:pPr>
+              <w:pStyle w:val="Compact"/>
+            </w:pPr>
+          </w:p>
+        </w:tc>
+        <w:tc>
+          <w:tcPr/>
+          <w:p>
+            <w:pPr>
+              <w:pStyle w:val="Compact"/>
+              <w:jc w:val="center"/>
+            </w:pPr>
+            <w:r>
+              <w:t xml:space="preserve">X</w:t>
+            </w:r>
+          </w:p>
+        </w:tc>
+        <w:tc>
+          <w:tcPr/>
+          <w:p>
+            <w:pPr>
+              <w:pStyle w:val="Compact"/>
+            </w:pPr>
+          </w:p>
+        </w:tc>
+      </w:tr>
+      <w:tr>
+        <w:tc>
+          <w:tcPr/>
+          <w:p>
+            <w:pPr>
+              <w:pStyle w:val="Compact"/>
+              <w:jc w:val="center"/>
+            </w:pPr>
+            <w:r>
+              <w:t xml:space="preserve">HSTP-MMAuth:</w:t>
+            </w:r>
+          </w:p>
+        </w:tc>
+        <w:tc>
+          <w:tcPr/>
+          <w:p>
+            <w:pPr>
+              <w:pStyle w:val="Compact"/>
+            </w:pPr>
+          </w:p>
+        </w:tc>
+        <w:tc>
+          <w:tcPr/>
+          <w:p>
+            <w:pPr>
+              <w:pStyle w:val="Compact"/>
+            </w:pPr>
+          </w:p>
+        </w:tc>
+        <w:tc>
+          <w:tcPr/>
+          <w:p>
+            <w:pPr>
+              <w:pStyle w:val="Compact"/>
+            </w:pPr>
+          </w:p>
+        </w:tc>
+        <w:tc>
+          <w:tcPr/>
+          <w:p>
+            <w:pPr>
+              <w:pStyle w:val="Compact"/>
+            </w:pPr>
+          </w:p>
+        </w:tc>
+        <w:tc>
+          <w:tcPr/>
+          <w:p>
+            <w:pPr>
+              <w:pStyle w:val="Compact"/>
+            </w:pPr>
+          </w:p>
+        </w:tc>
+        <w:tc>
+          <w:tcPr/>
+          <w:p>
+            <w:pPr>
+              <w:pStyle w:val="Compact"/>
+            </w:pPr>
+          </w:p>
+        </w:tc>
+      </w:tr>
+      <w:tr>
+        <w:tc>
+          <w:tcPr/>
+          <w:p>
+            <w:pPr>
+              <w:pStyle w:val="Compact"/>
+              <w:jc w:val="center"/>
+            </w:pPr>
+            <w:r>
+              <w:t xml:space="preserve">Multimedia authentication framework, workflows and procedures</w:t>
             </w:r>
           </w:p>
         </w:tc>
@@ -2847,10 +3045,10 @@
   <w:docDefaults>
     <w:rPrDefault>
       <w:rPr>
-        <w:rFonts w:asciiTheme="minorHAnsi" w:cstheme="minorBidi" w:eastAsiaTheme="minorHAnsi" w:hAnsiTheme="minorHAnsi"/>
+        <w:rFonts w:asciiTheme="minorHAnsi" w:cstheme="minorBidi" w:eastAsiaTheme="minorEastAsia" w:hAnsiTheme="minorHAnsi"/>
         <w:sz w:val="24"/>
         <w:szCs w:val="24"/>
-        <w:lang w:bidi="ar-SA" w:eastAsia="en-US" w:val="en-US"/>
+        <w:lang w:bidi="ar-SA" w:eastAsia="zh-CN" w:val="en-US"/>
       </w:rPr>
     </w:rPrDefault>
     <w:pPrDefault>
@@ -3391,13 +3589,6 @@
       </w:tblCellMar>
     </w:tblPr>
     <w:tblStylePr w:type="firstRow">
-      <w:tblPr>
-        <w:jc w:val="left"/>
-        <w:tblInd w:type="dxa" w:w="0"/>
-      </w:tblPr>
-      <w:trPr>
-        <w:jc w:val="left"/>
-      </w:trPr>
       <w:tcPr>
         <w:tcBorders>
           <w:bottom w:val="single"/>

</xml_diff>